<commit_message>
Resume: FRTB/Market Risk/ Model Risk Management/ Credit Risk/ Counter Party Credit Risk @ Deloitte (MNC)
</commit_message>
<xml_diff>
--- a/resumes/Resume_FRTB_Market_Risk__Model_Risk_Manage_Deloitte__MNC_.docx
+++ b/resumes/Resume_FRTB_Market_Risk__Model_Risk_Manage_Deloitte__MNC_.docx
@@ -562,7 +562,7 @@
           <w:sz w:val="19"/>
           <w:szCs w:val="19"/>
         </w:rPr>
-        <w:t>Built multi-API threat intelligence pipeline: submits suspicious URLs/IPs to VirusTotal, AbuseIPDB, and URLScan.io simultaneously; cross-references WHOIS registration age, DNS records, and SSL details to produce a unified phishing probability score using Python and virustotal api (threat intelligence feeds).</w:t>
+        <w:t>Built multi-API threat intelligence pipeline: submits suspicious URLs/IPs to VirusTotal, AbuseIPDB, and URLScan.io simultaneously; cross-references WHOIS registration age, DNS records, and SSL details to produce a unified phishing probability score using Python and VirusTotal API (threat intelligence feeds).</w:t>
       </w:r>
     </w:p>
     <w:p>
@@ -600,7 +600,7 @@
           <w:sz w:val="19"/>
           <w:szCs w:val="19"/>
         </w:rPr>
-        <w:t>Deployed Telegram bot interface enabling analysts to submit URLs for live ioc enrichment (threat intelligence); supports bulk CSV input/output for incident response workflows and includes osint enrichment (open-source intelligence) via theHarvester for domain profiling using Telegram bot and Python.</w:t>
+        <w:t>Deployed Telegram bot interface enabling analysts to submit URLs for live IOC enrichment (threat intelligence); supports bulk CSV input/output for incident response workflows and includes OSINT enrichment (open-source intelligence) via theHarvester for domain profiling using Telegram bot and Python.</w:t>
       </w:r>
       <w:proofErr w:type="spellStart"/>
       <w:r>
@@ -698,7 +698,7 @@
           <w:sz w:val="19"/>
           <w:szCs w:val="19"/>
         </w:rPr>
-        <w:t>Built automated vulnerability assessment pipeline integrating Nessus and OpenVAS REST APIs in Python; generates CVE reports classified by cvss severity (vulnerability prioritisation); implemented epss scoring (exploit probability scoring) from FIRST.org API to prioritise by actual exploit probability — a metric rarely used by freshers, using Nessus and OpenVAS.</w:t>
+        <w:t>Built automated vulnerability assessment pipeline integrating Nessus and OpenVAS REST APIs in Python; generates CVE reports classified by CVSS severity (vulnerability prioritisation); implemented EPSS scoring (exploit probability scoring) from FIRST.org API to prioritise by actual exploit probability — a metric rarely used by freshers, using NVD API and Nessus.</w:t>
       </w:r>
     </w:p>
     <w:p>
@@ -717,7 +717,7 @@
           <w:sz w:val="19"/>
           <w:szCs w:val="19"/>
         </w:rPr>
-        <w:t>Developed owasp top 10 (web application security) automated web checker that sends crafted HTTP requests to detect injection, broken auth, and SSRF vulnerabilities; documented SQL injection exploit and parameterised query remediation using Bash and Python.</w:t>
+        <w:t>Developed OWASP Top 10 (web application security) automated web checker that sends crafted HTTP requests to detect injection, broken auth, and SSRF vulnerabilities; documented SQL injection exploit and parameterised query remediation using Bash and OpenVAS.</w:t>
       </w:r>
     </w:p>
     <w:p>
@@ -736,7 +736,7 @@
           <w:sz w:val="19"/>
           <w:szCs w:val="19"/>
         </w:rPr>
-        <w:t>Automated scan scheduling via Bash and cron; built delta-scan logic to flag newly discovered CVEs and calculate remediation SLA deadlines (Critical=24hrs, High=7 days, Medium=30 days) for patch compliance (remediation tracking) tracking using OpenVAS and NVD API.</w:t>
+        <w:t>Automated scan scheduling via Bash and cron; built delta-scan logic to flag newly discovered CVEs and calculate remediation SLA deadlines (Critical=24hrs, High=7 days, Medium=30 days) for patch compliance (remediation tracking) tracking using Nessus and NVD API.</w:t>
       </w:r>
     </w:p>
     <w:p>
@@ -881,7 +881,7 @@
           <w:sz w:val="19"/>
           <w:szCs w:val="19"/>
         </w:rPr>
-        <w:t>MITRE ATT&amp;CK, OWASP Top 10, Incident Response (PICERL), audit trail documentation</w:t>
+        <w:t>MITRE ATT&amp;CK, OWASP Top 10, Incident Response (PICERL), audit trail documentation, Management</w:t>
       </w:r>
     </w:p>
     <w:p>

</xml_diff>